<commit_message>
small addition to the report
</commit_message>
<xml_diff>
--- a/Checkpoint 4/CPIV-16.docx
+++ b/Checkpoint 4/CPIV-16.docx
@@ -1196,6 +1196,32 @@
           <w:bCs/>
           <w:lang w:val="en-US"/>
         </w:rPr>
+        <w:t>Autocomplete Search</w:t>
+      </w:r>
+      <w:r>
+        <w:rPr>
+          <w:lang w:val="en-US"/>
+        </w:rPr>
+        <w:t xml:space="preserve"> – filters with many options (e.g., sets, types) now include search bars with autocomplete, helping users quickly locate specific filters.</w:t>
+      </w:r>
+    </w:p>
+    <w:p>
+      <w:pPr>
+        <w:numPr>
+          <w:ilvl w:val="0"/>
+          <w:numId w:val="9"/>
+        </w:numPr>
+        <w:spacing w:after="0"/>
+        <w:rPr>
+          <w:lang w:val="en-US"/>
+        </w:rPr>
+      </w:pPr>
+      <w:r>
+        <w:rPr>
+          <w:b/>
+          <w:bCs/>
+          <w:lang w:val="en-US"/>
+        </w:rPr>
         <w:t>Information Icon</w:t>
       </w:r>
       <w:r>
@@ -1279,6 +1305,7 @@
         <w:rPr>
           <w:lang w:val="en-US"/>
         </w:rPr>
+        <w:lastRenderedPageBreak/>
         <w:t>Line Chart which answers the Task 3: How does condition affect price in relation to set, type and year?</w:t>
       </w:r>
     </w:p>
@@ -1300,7 +1327,6 @@
         <w:rPr>
           <w:lang w:val="en-US"/>
         </w:rPr>
-        <w:lastRenderedPageBreak/>
         <w:t xml:space="preserve">Bar Chart which answers </w:t>
       </w:r>
       <w:proofErr w:type="gramStart"/>

</xml_diff>

<commit_message>
add CP5 report and improve CP4 improvement report
</commit_message>
<xml_diff>
--- a/Checkpoint 4/CPIV-16.docx
+++ b/Checkpoint 4/CPIV-16.docx
@@ -707,7 +707,23 @@
           <w:highlight w:val="yellow"/>
           <w:lang w:val="en-US"/>
         </w:rPr>
-        <w:t>Each idiom in the dashboard highlights a different perspective of this analytical theme:</w:t>
+        <w:t xml:space="preserve">Each idiom in the dashboard highlights a different perspective </w:t>
+      </w:r>
+      <w:proofErr w:type="gramStart"/>
+      <w:r>
+        <w:rPr>
+          <w:highlight w:val="yellow"/>
+          <w:lang w:val="en-US"/>
+        </w:rPr>
+        <w:t>of</w:t>
+      </w:r>
+      <w:proofErr w:type="gramEnd"/>
+      <w:r>
+        <w:rPr>
+          <w:highlight w:val="yellow"/>
+          <w:lang w:val="en-US"/>
+        </w:rPr>
+        <w:t xml:space="preserve"> this analytical theme:</w:t>
       </w:r>
     </w:p>
     <w:p>
@@ -783,6 +799,7 @@
         </w:rPr>
         <w:t xml:space="preserve"> ranks the </w:t>
       </w:r>
+      <w:proofErr w:type="gramStart"/>
       <w:r>
         <w:rPr>
           <w:b/>
@@ -790,7 +807,17 @@
           <w:highlight w:val="yellow"/>
           <w:lang w:val="en-US"/>
         </w:rPr>
-        <w:t>top-selling cards</w:t>
+        <w:t>top-selling</w:t>
+      </w:r>
+      <w:proofErr w:type="gramEnd"/>
+      <w:r>
+        <w:rPr>
+          <w:b/>
+          <w:bCs/>
+          <w:highlight w:val="yellow"/>
+          <w:lang w:val="en-US"/>
+        </w:rPr>
+        <w:t xml:space="preserve"> cards</w:t>
       </w:r>
       <w:r>
         <w:rPr>
@@ -934,7 +961,21 @@
         <w:rPr>
           <w:lang w:val="en-GB"/>
         </w:rPr>
-        <w:t>The architecture was extended from a single-idiom prototype into a multi-idiom, preprocessed dashboard, with emphasis on efficiency and coordinated interaction. Key changes are:</w:t>
+        <w:t xml:space="preserve">The architecture was extended from a single-idiom prototype into a multi-idiom, </w:t>
+      </w:r>
+      <w:proofErr w:type="spellStart"/>
+      <w:r>
+        <w:rPr>
+          <w:lang w:val="en-GB"/>
+        </w:rPr>
+        <w:t>preprocessed</w:t>
+      </w:r>
+      <w:proofErr w:type="spellEnd"/>
+      <w:r>
+        <w:rPr>
+          <w:lang w:val="en-GB"/>
+        </w:rPr>
+        <w:t xml:space="preserve"> dashboard, with emphasis on efficiency and coordinated interaction. Key changes are:</w:t>
       </w:r>
     </w:p>
     <w:p>
@@ -974,7 +1015,35 @@
         <w:rPr>
           <w:lang w:val="en-GB"/>
         </w:rPr>
-        <w:t>Selection now uses a selectedCards array (instead of a single selectedCard object), enabling multi-card comparisons.</w:t>
+        <w:t xml:space="preserve">Selection now uses a </w:t>
+      </w:r>
+      <w:proofErr w:type="spellStart"/>
+      <w:r>
+        <w:rPr>
+          <w:lang w:val="en-GB"/>
+        </w:rPr>
+        <w:t>selectedCards</w:t>
+      </w:r>
+      <w:proofErr w:type="spellEnd"/>
+      <w:r>
+        <w:rPr>
+          <w:lang w:val="en-GB"/>
+        </w:rPr>
+        <w:t xml:space="preserve"> array (instead of a single </w:t>
+      </w:r>
+      <w:proofErr w:type="spellStart"/>
+      <w:r>
+        <w:rPr>
+          <w:lang w:val="en-GB"/>
+        </w:rPr>
+        <w:t>selectedCard</w:t>
+      </w:r>
+      <w:proofErr w:type="spellEnd"/>
+      <w:r>
+        <w:rPr>
+          <w:lang w:val="en-GB"/>
+        </w:rPr>
+        <w:t xml:space="preserve"> object), enabling multi-card comparisons.</w:t>
       </w:r>
     </w:p>
     <w:p>
@@ -989,11 +1058,27 @@
           <w:lang w:val="en-GB"/>
         </w:rPr>
       </w:pPr>
-      <w:r>
-        <w:rPr>
-          <w:lang w:val="en-GB"/>
-        </w:rPr>
-        <w:t>updateSelectionAcrossPlots() was generalized to handle scatterplot circles, bar chart bars, and line chart paths, ensuring consistent highlighting across idioms.</w:t>
+      <w:proofErr w:type="spellStart"/>
+      <w:proofErr w:type="gramStart"/>
+      <w:r>
+        <w:rPr>
+          <w:lang w:val="en-GB"/>
+        </w:rPr>
+        <w:t>updateSelectionAcrossPlots</w:t>
+      </w:r>
+      <w:proofErr w:type="spellEnd"/>
+      <w:r>
+        <w:rPr>
+          <w:lang w:val="en-GB"/>
+        </w:rPr>
+        <w:t>(</w:t>
+      </w:r>
+      <w:proofErr w:type="gramEnd"/>
+      <w:r>
+        <w:rPr>
+          <w:lang w:val="en-GB"/>
+        </w:rPr>
+        <w:t>) was generalized to handle scatterplot circles, bar chart bars, and line chart paths, ensuring consistent highlighting across idioms.</w:t>
       </w:r>
     </w:p>
     <w:p>
@@ -1063,8 +1148,16 @@
         <w:rPr>
           <w:lang w:val="en-GB"/>
         </w:rPr>
-        <w:t xml:space="preserve"> and line chart is now pre-aggregated at load time (scatterTable</w:t>
-      </w:r>
+        <w:t xml:space="preserve"> and line chart is now pre-aggregated at load time (</w:t>
+      </w:r>
+      <w:proofErr w:type="spellStart"/>
+      <w:r>
+        <w:rPr>
+          <w:lang w:val="en-GB"/>
+        </w:rPr>
+        <w:t>scatterTable</w:t>
+      </w:r>
+      <w:proofErr w:type="spellEnd"/>
       <w:r>
         <w:rPr>
           <w:lang w:val="en-GB"/>
@@ -1075,7 +1168,21 @@
         <w:rPr>
           <w:lang w:val="en-GB"/>
         </w:rPr>
-        <w:t xml:space="preserve"> and lineTable).</w:t>
+        <w:t xml:space="preserve"> and </w:t>
+      </w:r>
+      <w:proofErr w:type="spellStart"/>
+      <w:r>
+        <w:rPr>
+          <w:lang w:val="en-GB"/>
+        </w:rPr>
+        <w:t>lineTable</w:t>
+      </w:r>
+      <w:proofErr w:type="spellEnd"/>
+      <w:r>
+        <w:rPr>
+          <w:lang w:val="en-GB"/>
+        </w:rPr>
+        <w:t>).</w:t>
       </w:r>
     </w:p>
     <w:p>
@@ -1206,7 +1313,35 @@
         <w:rPr>
           <w:lang w:val="en-GB"/>
         </w:rPr>
-        <w:t>Each chart has its own module (createBarchart, createLineChart, etc.), keeping the system modular and extensible.</w:t>
+        <w:t>Each chart has its own module (</w:t>
+      </w:r>
+      <w:proofErr w:type="spellStart"/>
+      <w:r>
+        <w:rPr>
+          <w:lang w:val="en-GB"/>
+        </w:rPr>
+        <w:t>createBarchart</w:t>
+      </w:r>
+      <w:proofErr w:type="spellEnd"/>
+      <w:r>
+        <w:rPr>
+          <w:lang w:val="en-GB"/>
+        </w:rPr>
+        <w:t xml:space="preserve">, </w:t>
+      </w:r>
+      <w:proofErr w:type="spellStart"/>
+      <w:r>
+        <w:rPr>
+          <w:lang w:val="en-GB"/>
+        </w:rPr>
+        <w:t>createLineChart</w:t>
+      </w:r>
+      <w:proofErr w:type="spellEnd"/>
+      <w:r>
+        <w:rPr>
+          <w:lang w:val="en-GB"/>
+        </w:rPr>
+        <w:t>, etc.), keeping the system modular and extensible.</w:t>
       </w:r>
     </w:p>
     <w:p>
@@ -1221,11 +1356,27 @@
           <w:lang w:val="en-GB"/>
         </w:rPr>
       </w:pPr>
-      <w:r>
-        <w:rPr>
-          <w:lang w:val="en-GB"/>
-        </w:rPr>
-        <w:t>updateCharts() orchestrates updates across all idioms using the same filtered subset of data.</w:t>
+      <w:proofErr w:type="spellStart"/>
+      <w:proofErr w:type="gramStart"/>
+      <w:r>
+        <w:rPr>
+          <w:lang w:val="en-GB"/>
+        </w:rPr>
+        <w:t>updateCharts</w:t>
+      </w:r>
+      <w:proofErr w:type="spellEnd"/>
+      <w:r>
+        <w:rPr>
+          <w:lang w:val="en-GB"/>
+        </w:rPr>
+        <w:t>(</w:t>
+      </w:r>
+      <w:proofErr w:type="gramEnd"/>
+      <w:r>
+        <w:rPr>
+          <w:lang w:val="en-GB"/>
+        </w:rPr>
+        <w:t>) orchestrates updates across all idioms using the same filtered subset of data.</w:t>
       </w:r>
     </w:p>
     <w:p>
@@ -1343,14 +1494,71 @@
         <w:rPr>
           <w:lang w:val="en-GB"/>
         </w:rPr>
+        <w:lastRenderedPageBreak/>
         <w:t>New tooltip/info icon provides interaction hints, improving user onboarding.</w:t>
+      </w:r>
+    </w:p>
+    <w:p>
+      <w:pPr>
+        <w:spacing w:after="0"/>
+        <w:jc w:val="left"/>
+        <w:rPr>
+          <w:lang w:val="en-GB"/>
+        </w:rPr>
+      </w:pPr>
+      <w:r>
+        <w:rPr>
+          <w:noProof/>
+          <w:lang w:val="en-GB"/>
+        </w:rPr>
+        <w:drawing>
+          <wp:inline distT="0" distB="0" distL="0" distR="0" wp14:anchorId="13B74141" wp14:editId="68059A38">
+            <wp:extent cx="5760720" cy="1626235"/>
+            <wp:effectExtent l="0" t="0" r="0" b="0"/>
+            <wp:docPr id="1320086736" name="Graphic 2"/>
+            <wp:cNvGraphicFramePr>
+              <a:graphicFrameLocks xmlns:a="http://schemas.openxmlformats.org/drawingml/2006/main" noChangeAspect="1"/>
+            </wp:cNvGraphicFramePr>
+            <a:graphic xmlns:a="http://schemas.openxmlformats.org/drawingml/2006/main">
+              <a:graphicData uri="http://schemas.openxmlformats.org/drawingml/2006/picture">
+                <pic:pic xmlns:pic="http://schemas.openxmlformats.org/drawingml/2006/picture">
+                  <pic:nvPicPr>
+                    <pic:cNvPr id="1320086736" name="Graphic 1320086736"/>
+                    <pic:cNvPicPr/>
+                  </pic:nvPicPr>
+                  <pic:blipFill>
+                    <a:blip r:embed="rId7">
+                      <a:extLst>
+                        <a:ext uri="{96DAC541-7B7A-43D3-8B79-37D633B846F1}">
+                          <asvg:svgBlip xmlns:asvg="http://schemas.microsoft.com/office/drawing/2016/SVG/main" r:embed="rId8"/>
+                        </a:ext>
+                      </a:extLst>
+                    </a:blip>
+                    <a:stretch>
+                      <a:fillRect/>
+                    </a:stretch>
+                  </pic:blipFill>
+                  <pic:spPr>
+                    <a:xfrm>
+                      <a:off x="0" y="0"/>
+                      <a:ext cx="5760720" cy="1626235"/>
+                    </a:xfrm>
+                    <a:prstGeom prst="rect">
+                      <a:avLst/>
+                    </a:prstGeom>
+                  </pic:spPr>
+                </pic:pic>
+              </a:graphicData>
+            </a:graphic>
+          </wp:inline>
+        </w:drawing>
       </w:r>
     </w:p>
     <w:p>
       <w:pPr>
         <w:pStyle w:val="Heading1"/>
         <w:keepLines w:val="0"/>
-        <w:spacing w:before="0" w:after="160"/>
+        <w:spacing w:before="0"/>
         <w:jc w:val="left"/>
         <w:rPr>
           <w:lang w:val="en-GB"/>
@@ -1364,6 +1572,9 @@
       </w:r>
     </w:p>
     <w:p>
+      <w:pPr>
+        <w:spacing w:after="0"/>
+      </w:pPr>
       <w:r>
         <w:rPr>
           <w:noProof/>
@@ -1390,7 +1601,7 @@
                     <pic:cNvPicPr/>
                   </pic:nvPicPr>
                   <pic:blipFill>
-                    <a:blip r:embed="rId7" cstate="print">
+                    <a:blip r:embed="rId9" cstate="print">
                       <a:extLst>
                         <a:ext uri="{28A0092B-C50C-407E-A947-70E740481C1C}">
                           <a14:useLocalDpi xmlns:a14="http://schemas.microsoft.com/office/drawing/2010/main" val="0"/>
@@ -1419,6 +1630,7 @@
     </w:p>
     <w:p>
       <w:pPr>
+        <w:spacing w:after="0"/>
         <w:jc w:val="left"/>
         <w:rPr>
           <w:lang w:val="en-US"/>
@@ -1437,6 +1649,7 @@
           <w:ilvl w:val="0"/>
           <w:numId w:val="3"/>
         </w:numPr>
+        <w:spacing w:after="0"/>
         <w:jc w:val="left"/>
         <w:rPr>
           <w:lang w:val="en-US"/>
@@ -1463,6 +1676,7 @@
           <w:ilvl w:val="0"/>
           <w:numId w:val="3"/>
         </w:numPr>
+        <w:spacing w:after="0"/>
         <w:jc w:val="left"/>
         <w:rPr>
           <w:lang w:val="en-US"/>
@@ -1489,6 +1703,7 @@
           <w:ilvl w:val="0"/>
           <w:numId w:val="3"/>
         </w:numPr>
+        <w:spacing w:after="0"/>
         <w:jc w:val="left"/>
         <w:rPr>
           <w:lang w:val="en-US"/>
@@ -1511,6 +1726,7 @@
     </w:p>
     <w:p>
       <w:pPr>
+        <w:spacing w:after="0"/>
         <w:jc w:val="left"/>
         <w:rPr>
           <w:lang w:val="en-US"/>
@@ -1527,7 +1743,7 @@
       <w:pPr>
         <w:pStyle w:val="Heading1"/>
         <w:keepLines w:val="0"/>
-        <w:spacing w:before="0" w:after="160"/>
+        <w:spacing w:before="0"/>
         <w:jc w:val="left"/>
         <w:rPr>
           <w:lang w:val="en-GB"/>
@@ -1542,6 +1758,7 @@
     </w:p>
     <w:p>
       <w:pPr>
+        <w:spacing w:after="0"/>
         <w:jc w:val="left"/>
         <w:rPr>
           <w:lang w:val="en-US"/>
@@ -1567,6 +1784,7 @@
           <w:ilvl w:val="0"/>
           <w:numId w:val="2"/>
         </w:numPr>
+        <w:spacing w:after="0"/>
         <w:jc w:val="left"/>
         <w:rPr>
           <w:lang w:val="en-US"/>
@@ -1586,6 +1804,7 @@
           <w:ilvl w:val="0"/>
           <w:numId w:val="2"/>
         </w:numPr>
+        <w:spacing w:after="0"/>
         <w:jc w:val="left"/>
         <w:rPr>
           <w:b/>
@@ -1597,11 +1816,40 @@
         <w:rPr>
           <w:lang w:val="en-US"/>
         </w:rPr>
-        <w:t>Bar Chart which answers the Task 1: Are there any favourite or more popular cards per set and per type?</w:t>
-      </w:r>
-    </w:p>
-    <w:p>
-      <w:pPr>
+        <w:t xml:space="preserve">Bar Chart which answers </w:t>
+      </w:r>
+      <w:proofErr w:type="gramStart"/>
+      <w:r>
+        <w:rPr>
+          <w:lang w:val="en-US"/>
+        </w:rPr>
+        <w:t>the Task</w:t>
+      </w:r>
+      <w:proofErr w:type="gramEnd"/>
+      <w:r>
+        <w:rPr>
+          <w:lang w:val="en-US"/>
+        </w:rPr>
+        <w:t xml:space="preserve"> 1: Are there any </w:t>
+      </w:r>
+      <w:proofErr w:type="spellStart"/>
+      <w:r>
+        <w:rPr>
+          <w:lang w:val="en-US"/>
+        </w:rPr>
+        <w:t>favourite</w:t>
+      </w:r>
+      <w:proofErr w:type="spellEnd"/>
+      <w:r>
+        <w:rPr>
+          <w:lang w:val="en-US"/>
+        </w:rPr>
+        <w:t xml:space="preserve"> or more popular cards per set and per type?</w:t>
+      </w:r>
+    </w:p>
+    <w:p>
+      <w:pPr>
+        <w:spacing w:after="0"/>
         <w:jc w:val="left"/>
         <w:rPr>
           <w:lang w:val="en-US"/>
@@ -1634,15 +1882,34 @@
           <w:ilvl w:val="0"/>
           <w:numId w:val="8"/>
         </w:numPr>
-        <w:jc w:val="left"/>
-      </w:pPr>
+        <w:spacing w:after="0"/>
+        <w:jc w:val="left"/>
+      </w:pPr>
+      <w:proofErr w:type="spellStart"/>
       <w:r>
         <w:rPr>
           <w:b/>
           <w:bCs/>
         </w:rPr>
-        <w:t>Scatterplot &amp; Bar Chart</w:t>
-      </w:r>
+        <w:t>Scatterplot</w:t>
+      </w:r>
+      <w:proofErr w:type="spellEnd"/>
+      <w:r>
+        <w:rPr>
+          <w:b/>
+          <w:bCs/>
+        </w:rPr>
+        <w:t xml:space="preserve"> &amp; Bar </w:t>
+      </w:r>
+      <w:proofErr w:type="spellStart"/>
+      <w:r>
+        <w:rPr>
+          <w:b/>
+          <w:bCs/>
+        </w:rPr>
+        <w:t>Chart</w:t>
+      </w:r>
+      <w:proofErr w:type="spellEnd"/>
     </w:p>
     <w:p>
       <w:pPr>
@@ -1650,16 +1917,31 @@
           <w:ilvl w:val="1"/>
           <w:numId w:val="8"/>
         </w:numPr>
-        <w:jc w:val="left"/>
-        <w:rPr>
-          <w:lang w:val="en-US"/>
-        </w:rPr>
-      </w:pPr>
-      <w:r>
-        <w:rPr>
-          <w:lang w:val="en-US"/>
-        </w:rPr>
-        <w:t>Data is pre-aggregated with d3.rollup into a scatterTable.</w:t>
+        <w:spacing w:after="0"/>
+        <w:jc w:val="left"/>
+        <w:rPr>
+          <w:lang w:val="en-US"/>
+        </w:rPr>
+      </w:pPr>
+      <w:r>
+        <w:rPr>
+          <w:lang w:val="en-US"/>
+        </w:rPr>
+        <w:t xml:space="preserve">Data is pre-aggregated with d3.rollup into a </w:t>
+      </w:r>
+      <w:proofErr w:type="spellStart"/>
+      <w:r>
+        <w:rPr>
+          <w:lang w:val="en-US"/>
+        </w:rPr>
+        <w:t>scatterTable</w:t>
+      </w:r>
+      <w:proofErr w:type="spellEnd"/>
+      <w:r>
+        <w:rPr>
+          <w:lang w:val="en-US"/>
+        </w:rPr>
+        <w:t>.</w:t>
       </w:r>
     </w:p>
     <w:p>
@@ -1668,6 +1950,7 @@
           <w:ilvl w:val="1"/>
           <w:numId w:val="8"/>
         </w:numPr>
+        <w:spacing w:after="0"/>
         <w:jc w:val="left"/>
         <w:rPr>
           <w:lang w:val="en-US"/>
@@ -1686,15 +1969,17 @@
           <w:ilvl w:val="1"/>
           <w:numId w:val="8"/>
         </w:numPr>
-        <w:jc w:val="left"/>
-        <w:rPr>
-          <w:lang w:val="en-US"/>
-        </w:rPr>
-      </w:pPr>
-      <w:r>
-        <w:rPr>
-          <w:lang w:val="en-US"/>
-        </w:rPr>
+        <w:spacing w:after="0"/>
+        <w:jc w:val="left"/>
+        <w:rPr>
+          <w:lang w:val="en-US"/>
+        </w:rPr>
+      </w:pPr>
+      <w:r>
+        <w:rPr>
+          <w:lang w:val="en-US"/>
+        </w:rPr>
+        <w:lastRenderedPageBreak/>
         <w:t xml:space="preserve">The </w:t>
       </w:r>
       <w:r>
@@ -1732,15 +2017,34 @@
           <w:ilvl w:val="0"/>
           <w:numId w:val="8"/>
         </w:numPr>
-        <w:jc w:val="left"/>
-      </w:pPr>
+        <w:spacing w:after="0"/>
+        <w:jc w:val="left"/>
+      </w:pPr>
+      <w:proofErr w:type="spellStart"/>
       <w:r>
         <w:rPr>
           <w:b/>
           <w:bCs/>
         </w:rPr>
-        <w:t>Line Chart</w:t>
-      </w:r>
+        <w:t>Line</w:t>
+      </w:r>
+      <w:proofErr w:type="spellEnd"/>
+      <w:r>
+        <w:rPr>
+          <w:b/>
+          <w:bCs/>
+        </w:rPr>
+        <w:t xml:space="preserve"> </w:t>
+      </w:r>
+      <w:proofErr w:type="spellStart"/>
+      <w:r>
+        <w:rPr>
+          <w:b/>
+          <w:bCs/>
+        </w:rPr>
+        <w:t>Chart</w:t>
+      </w:r>
+      <w:proofErr w:type="spellEnd"/>
     </w:p>
     <w:p>
       <w:pPr>
@@ -1748,16 +2052,31 @@
           <w:ilvl w:val="1"/>
           <w:numId w:val="8"/>
         </w:numPr>
-        <w:jc w:val="left"/>
-        <w:rPr>
-          <w:lang w:val="en-US"/>
-        </w:rPr>
-      </w:pPr>
-      <w:r>
-        <w:rPr>
-          <w:lang w:val="en-US"/>
-        </w:rPr>
-        <w:t xml:space="preserve">A second table (lineTable) is precomputed, normalizing card </w:t>
+        <w:spacing w:after="0"/>
+        <w:jc w:val="left"/>
+        <w:rPr>
+          <w:lang w:val="en-US"/>
+        </w:rPr>
+      </w:pPr>
+      <w:r>
+        <w:rPr>
+          <w:lang w:val="en-US"/>
+        </w:rPr>
+        <w:t>A second table (</w:t>
+      </w:r>
+      <w:proofErr w:type="spellStart"/>
+      <w:r>
+        <w:rPr>
+          <w:lang w:val="en-US"/>
+        </w:rPr>
+        <w:t>lineTable</w:t>
+      </w:r>
+      <w:proofErr w:type="spellEnd"/>
+      <w:r>
+        <w:rPr>
+          <w:lang w:val="en-US"/>
+        </w:rPr>
+        <w:t xml:space="preserve">) is precomputed, normalizing card </w:t>
       </w:r>
       <w:r>
         <w:rPr>
@@ -1780,6 +2099,7 @@
           <w:ilvl w:val="1"/>
           <w:numId w:val="8"/>
         </w:numPr>
+        <w:spacing w:after="0"/>
         <w:jc w:val="left"/>
         <w:rPr>
           <w:lang w:val="en-US"/>
@@ -1798,15 +2118,34 @@
           <w:ilvl w:val="0"/>
           <w:numId w:val="8"/>
         </w:numPr>
-        <w:jc w:val="left"/>
-      </w:pPr>
+        <w:spacing w:after="0"/>
+        <w:jc w:val="left"/>
+      </w:pPr>
+      <w:proofErr w:type="spellStart"/>
       <w:r>
         <w:rPr>
           <w:b/>
           <w:bCs/>
         </w:rPr>
-        <w:t>Efficiency Gains</w:t>
-      </w:r>
+        <w:t>Efficiency</w:t>
+      </w:r>
+      <w:proofErr w:type="spellEnd"/>
+      <w:r>
+        <w:rPr>
+          <w:b/>
+          <w:bCs/>
+        </w:rPr>
+        <w:t xml:space="preserve"> </w:t>
+      </w:r>
+      <w:proofErr w:type="spellStart"/>
+      <w:r>
+        <w:rPr>
+          <w:b/>
+          <w:bCs/>
+        </w:rPr>
+        <w:t>Gains</w:t>
+      </w:r>
+      <w:proofErr w:type="spellEnd"/>
     </w:p>
     <w:p>
       <w:pPr>
@@ -1814,6 +2153,7 @@
           <w:ilvl w:val="1"/>
           <w:numId w:val="8"/>
         </w:numPr>
+        <w:spacing w:after="0"/>
         <w:jc w:val="left"/>
         <w:rPr>
           <w:lang w:val="en-US"/>
@@ -1825,6 +2165,7 @@
         </w:rPr>
         <w:t xml:space="preserve">Unlike CP III, where metrics were recomputed after each filter change, CP IV builds </w:t>
       </w:r>
+      <w:proofErr w:type="spellStart"/>
       <w:r>
         <w:rPr>
           <w:b/>
@@ -1833,12 +2174,14 @@
         </w:rPr>
         <w:t>scatterTable</w:t>
       </w:r>
+      <w:proofErr w:type="spellEnd"/>
       <w:r>
         <w:rPr>
           <w:lang w:val="en-US"/>
         </w:rPr>
         <w:t xml:space="preserve"> and </w:t>
       </w:r>
+      <w:proofErr w:type="spellStart"/>
       <w:r>
         <w:rPr>
           <w:b/>
@@ -1847,6 +2190,7 @@
         </w:rPr>
         <w:t>lineTable</w:t>
       </w:r>
+      <w:proofErr w:type="spellEnd"/>
       <w:r>
         <w:rPr>
           <w:lang w:val="en-US"/>
@@ -1884,6 +2228,7 @@
           <w:ilvl w:val="1"/>
           <w:numId w:val="8"/>
         </w:numPr>
+        <w:spacing w:after="0"/>
         <w:jc w:val="left"/>
         <w:rPr>
           <w:lang w:val="en-US"/>
@@ -1895,14 +2240,6 @@
         </w:rPr>
         <w:t>This ensures fast updates and smooth transitions even when multiple idioms are active.</w:t>
       </w:r>
-    </w:p>
-    <w:p>
-      <w:pPr>
-        <w:jc w:val="left"/>
-        <w:rPr>
-          <w:lang w:val="en-US"/>
-        </w:rPr>
-      </w:pPr>
     </w:p>
     <w:p>
       <w:pPr>
@@ -2387,6 +2724,7 @@
           <w:highlight w:val="yellow"/>
           <w:lang w:val="en-US"/>
         </w:rPr>
+        <w:lastRenderedPageBreak/>
         <w:t>Several circles marking individual condition averages.</w:t>
       </w:r>
       <w:r>
@@ -2512,13 +2850,41 @@
           <w:highlight w:val="yellow"/>
         </w:rPr>
       </w:pPr>
+      <w:proofErr w:type="spellStart"/>
       <w:r>
         <w:rPr>
           <w:b/>
           <w:bCs/>
           <w:highlight w:val="yellow"/>
         </w:rPr>
-        <w:t>Interaction Features:</w:t>
+        <w:t>Interaction</w:t>
+      </w:r>
+      <w:proofErr w:type="spellEnd"/>
+      <w:r>
+        <w:rPr>
+          <w:b/>
+          <w:bCs/>
+          <w:highlight w:val="yellow"/>
+        </w:rPr>
+        <w:t xml:space="preserve"> </w:t>
+      </w:r>
+      <w:proofErr w:type="spellStart"/>
+      <w:r>
+        <w:rPr>
+          <w:b/>
+          <w:bCs/>
+          <w:highlight w:val="yellow"/>
+        </w:rPr>
+        <w:t>Features</w:t>
+      </w:r>
+      <w:proofErr w:type="spellEnd"/>
+      <w:r>
+        <w:rPr>
+          <w:b/>
+          <w:bCs/>
+          <w:highlight w:val="yellow"/>
+        </w:rPr>
+        <w:t>:</w:t>
       </w:r>
     </w:p>
     <w:p>
@@ -2581,7 +2947,23 @@
           <w:highlight w:val="yellow"/>
           <w:lang w:val="en-US"/>
         </w:rPr>
-        <w:t>Clicking a line or point selects that card; Ctrl/Cmd click adds or removes cards from the comparison set.</w:t>
+        <w:t>Clicking a line or point selects that card; Ctrl/</w:t>
+      </w:r>
+      <w:proofErr w:type="spellStart"/>
+      <w:r>
+        <w:rPr>
+          <w:highlight w:val="yellow"/>
+          <w:lang w:val="en-US"/>
+        </w:rPr>
+        <w:t>Cmd</w:t>
+      </w:r>
+      <w:proofErr w:type="spellEnd"/>
+      <w:r>
+        <w:rPr>
+          <w:highlight w:val="yellow"/>
+          <w:lang w:val="en-US"/>
+        </w:rPr>
+        <w:t xml:space="preserve"> click adds or removes cards from the comparison set.</w:t>
       </w:r>
     </w:p>
     <w:p>
@@ -2713,7 +3095,21 @@
         <w:rPr>
           <w:lang w:val="en-US"/>
         </w:rPr>
-        <w:t>The integration model from CP III (shared data, linked views, global deselect) is maintained, but extended to cover the new idioms.</w:t>
+        <w:t xml:space="preserve">The integration model from CP III (shared data, linked views, global </w:t>
+      </w:r>
+      <w:proofErr w:type="gramStart"/>
+      <w:r>
+        <w:rPr>
+          <w:lang w:val="en-US"/>
+        </w:rPr>
+        <w:t>deselect</w:t>
+      </w:r>
+      <w:proofErr w:type="gramEnd"/>
+      <w:r>
+        <w:rPr>
+          <w:lang w:val="en-US"/>
+        </w:rPr>
+        <w:t>) is maintained, but extended to cover the new idioms.</w:t>
       </w:r>
     </w:p>
     <w:p>
@@ -2791,7 +3187,21 @@
         <w:rPr>
           <w:lang w:val="en-US"/>
         </w:rPr>
-        <w:t>The mechanism remains modular: each chart listens to the same global selectedCards array, ensuring that future idioms (e.g., violin plot) will integrate without structural changes.</w:t>
+        <w:t xml:space="preserve">The mechanism remains modular: each chart listens to the same global </w:t>
+      </w:r>
+      <w:proofErr w:type="spellStart"/>
+      <w:r>
+        <w:rPr>
+          <w:lang w:val="en-US"/>
+        </w:rPr>
+        <w:t>selectedCards</w:t>
+      </w:r>
+      <w:proofErr w:type="spellEnd"/>
+      <w:r>
+        <w:rPr>
+          <w:lang w:val="en-US"/>
+        </w:rPr>
+        <w:t xml:space="preserve"> array, ensuring that future idioms (e.g., violin plot) will integrate without structural changes.</w:t>
       </w:r>
     </w:p>
     <w:sectPr>
@@ -5928,6 +6338,7 @@
   <w:style w:type="character" w:default="1" w:styleId="DefaultParagraphFont">
     <w:name w:val="Default Paragraph Font"/>
     <w:uiPriority w:val="1"/>
+    <w:semiHidden/>
     <w:unhideWhenUsed/>
   </w:style>
   <w:style w:type="table" w:default="1" w:styleId="TableNormal">

</xml_diff>